<commit_message>
Bug fix: Import XML file path changed to site specific
</commit_message>
<xml_diff>
--- a/link_textmaster/documentation/TextMaster_LINK_Integration-SFRA.docx
+++ b/link_textmaster/documentation/TextMaster_LINK_Integration-SFRA.docx
@@ -44,12 +44,12 @@
           <wp:inline distB="0" distT="0" distL="0" distR="0">
             <wp:extent cx="6682963" cy="1462285"/>
             <wp:effectExtent b="0" l="0" r="0" t="0"/>
-            <wp:docPr id="4" name="image10.png"/>
+            <wp:docPr id="4" name="image7.png"/>
             <a:graphic>
               <a:graphicData uri="http://schemas.openxmlformats.org/drawingml/2006/picture">
                 <pic:pic>
                   <pic:nvPicPr>
-                    <pic:cNvPr id="0" name="image10.png"/>
+                    <pic:cNvPr id="0" name="image7.png"/>
                     <pic:cNvPicPr preferRelativeResize="0"/>
                   </pic:nvPicPr>
                   <pic:blipFill>
@@ -162,7 +162,7 @@
           <w:szCs w:val="24"/>
           <w:rtl w:val="0"/>
         </w:rPr>
-        <w:t xml:space="preserve">2.2</w:t>
+        <w:t xml:space="preserve">2.3</w:t>
       </w:r>
       <w:r>
         <w:rPr>
@@ -243,12 +243,12 @@
             <wp:extent cx="5947410" cy="1447800"/>
             <wp:effectExtent b="0" l="0" r="0" t="0"/>
             <wp:wrapNone/>
-            <wp:docPr id="16" name="image4.png"/>
+            <wp:docPr id="16" name="image2.png"/>
             <a:graphic>
               <a:graphicData uri="http://schemas.openxmlformats.org/drawingml/2006/picture">
                 <pic:pic>
                   <pic:nvPicPr>
-                    <pic:cNvPr id="0" name="image4.png"/>
+                    <pic:cNvPr id="0" name="image2.png"/>
                     <pic:cNvPicPr preferRelativeResize="0"/>
                   </pic:nvPicPr>
                   <pic:blipFill>
@@ -324,6 +324,7 @@
     </w:p>
     <w:sdt>
       <w:sdtPr>
+        <w:id w:val="758383868"/>
         <w:docPartObj>
           <w:docPartGallery w:val="Table of Contents"/>
           <w:docPartUnique w:val="1"/>
@@ -1987,7 +1988,7 @@
               </w:rPr>
               <w:t xml:space="preserve">5.3 General Advice</w:t>
               <w:tab/>
-              <w:t xml:space="preserve">15</w:t>
+              <w:t xml:space="preserve">16</w:t>
             </w:r>
           </w:hyperlink>
           <w:r>
@@ -2084,7 +2085,7 @@
               </w:rPr>
               <w:t xml:space="preserve">6.1 Send content for translation</w:t>
               <w:tab/>
-              <w:t xml:space="preserve">16</w:t>
+              <w:t xml:space="preserve">17</w:t>
             </w:r>
           </w:hyperlink>
           <w:r>
@@ -2182,7 +2183,7 @@
               </w:rPr>
               <w:t xml:space="preserve">6.2.1 Primary Dashboard</w:t>
               <w:tab/>
-              <w:t xml:space="preserve">18</w:t>
+              <w:t xml:space="preserve">19</w:t>
             </w:r>
           </w:hyperlink>
           <w:r>
@@ -2231,7 +2232,7 @@
               </w:rPr>
               <w:t xml:space="preserve">6.2.2 Secondary Dashboard</w:t>
               <w:tab/>
-              <w:t xml:space="preserve">18</w:t>
+              <w:t xml:space="preserve">19</w:t>
             </w:r>
           </w:hyperlink>
           <w:r>
@@ -2329,7 +2330,7 @@
               </w:rPr>
               <w:t xml:space="preserve">6.4 Note on Project AutoLaunch</w:t>
               <w:tab/>
-              <w:t xml:space="preserve">19</w:t>
+              <w:t xml:space="preserve">20</w:t>
             </w:r>
           </w:hyperlink>
           <w:r>
@@ -2378,7 +2379,7 @@
               </w:rPr>
               <w:t xml:space="preserve">6.5 Note on Page Designer</w:t>
               <w:tab/>
-              <w:t xml:space="preserve">19</w:t>
+              <w:t xml:space="preserve">20</w:t>
             </w:r>
           </w:hyperlink>
           <w:r>
@@ -2427,7 +2428,7 @@
               </w:rPr>
               <w:t xml:space="preserve">6.6 Note on Variation Attribute export</w:t>
               <w:tab/>
-              <w:t xml:space="preserve">20</w:t>
+              <w:t xml:space="preserve">21</w:t>
             </w:r>
           </w:hyperlink>
           <w:r>
@@ -2475,7 +2476,7 @@
               </w:rPr>
               <w:t xml:space="preserve">7. Storefront Functionality</w:t>
               <w:tab/>
-              <w:t xml:space="preserve">20</w:t>
+              <w:t xml:space="preserve">21</w:t>
             </w:r>
           </w:hyperlink>
           <w:r>
@@ -2523,7 +2524,7 @@
               </w:rPr>
               <w:t xml:space="preserve">8. Known Issues</w:t>
               <w:tab/>
-              <w:t xml:space="preserve">20</w:t>
+              <w:t xml:space="preserve">21</w:t>
             </w:r>
           </w:hyperlink>
           <w:r>
@@ -6179,12 +6180,12 @@
           <wp:inline distB="0" distT="0" distL="0" distR="0">
             <wp:extent cx="6130290" cy="2669540"/>
             <wp:effectExtent b="0" l="0" r="0" t="0"/>
-            <wp:docPr descr="A screenshot of a social media post&#10;&#10;Description automatically generated" id="5" name="image5.png"/>
+            <wp:docPr descr="A screenshot of a social media post&#10;&#10;Description automatically generated" id="5" name="image11.png"/>
             <a:graphic>
               <a:graphicData uri="http://schemas.openxmlformats.org/drawingml/2006/picture">
                 <pic:pic>
                   <pic:nvPicPr>
-                    <pic:cNvPr descr="A screenshot of a social media post&#10;&#10;Description automatically generated" id="0" name="image5.png"/>
+                    <pic:cNvPr descr="A screenshot of a social media post&#10;&#10;Description automatically generated" id="0" name="image11.png"/>
                     <pic:cNvPicPr preferRelativeResize="0"/>
                   </pic:nvPicPr>
                   <pic:blipFill>
@@ -7089,12 +7090,12 @@
           <wp:inline distB="0" distT="0" distL="0" distR="0">
             <wp:extent cx="3935730" cy="5376812"/>
             <wp:effectExtent b="0" l="0" r="0" t="0"/>
-            <wp:docPr id="6" name="image2.png"/>
+            <wp:docPr id="6" name="image15.png"/>
             <a:graphic>
               <a:graphicData uri="http://schemas.openxmlformats.org/drawingml/2006/picture">
                 <pic:pic>
                   <pic:nvPicPr>
-                    <pic:cNvPr id="0" name="image2.png"/>
+                    <pic:cNvPr id="0" name="image15.png"/>
                     <pic:cNvPicPr preferRelativeResize="0"/>
                   </pic:nvPicPr>
                   <pic:blipFill>
@@ -7571,12 +7572,12 @@
           <wp:inline distB="0" distT="0" distL="0" distR="0">
             <wp:extent cx="6286500" cy="2837815"/>
             <wp:effectExtent b="0" l="0" r="0" t="0"/>
-            <wp:docPr descr="A screenshot of a social media post&#10;&#10;Description automatically generated" id="9" name="image13.png"/>
+            <wp:docPr descr="A screenshot of a social media post&#10;&#10;Description automatically generated" id="9" name="image17.png"/>
             <a:graphic>
               <a:graphicData uri="http://schemas.openxmlformats.org/drawingml/2006/picture">
                 <pic:pic>
                   <pic:nvPicPr>
-                    <pic:cNvPr descr="A screenshot of a social media post&#10;&#10;Description automatically generated" id="0" name="image13.png"/>
+                    <pic:cNvPr descr="A screenshot of a social media post&#10;&#10;Description automatically generated" id="0" name="image17.png"/>
                     <pic:cNvPicPr preferRelativeResize="0"/>
                   </pic:nvPicPr>
                   <pic:blipFill>
@@ -8728,12 +8729,12 @@
           <wp:inline distB="0" distT="0" distL="0" distR="0">
             <wp:extent cx="6286500" cy="2790825"/>
             <wp:effectExtent b="0" l="0" r="0" t="0"/>
-            <wp:docPr descr="A screenshot of a social media post&#10;&#10;Description automatically generated" id="8" name="image8.png"/>
+            <wp:docPr descr="A screenshot of a social media post&#10;&#10;Description automatically generated" id="8" name="image9.png"/>
             <a:graphic>
               <a:graphicData uri="http://schemas.openxmlformats.org/drawingml/2006/picture">
                 <pic:pic>
                   <pic:nvPicPr>
-                    <pic:cNvPr descr="A screenshot of a social media post&#10;&#10;Description automatically generated" id="0" name="image8.png"/>
+                    <pic:cNvPr descr="A screenshot of a social media post&#10;&#10;Description automatically generated" id="0" name="image9.png"/>
                     <pic:cNvPicPr preferRelativeResize="0"/>
                   </pic:nvPicPr>
                   <pic:blipFill>
@@ -9348,12 +9349,12 @@
           <wp:inline distB="0" distT="0" distL="0" distR="0">
             <wp:extent cx="6286500" cy="2524355"/>
             <wp:effectExtent b="0" l="0" r="0" t="0"/>
-            <wp:docPr id="11" name="image15.png"/>
+            <wp:docPr id="11" name="image10.png"/>
             <a:graphic>
               <a:graphicData uri="http://schemas.openxmlformats.org/drawingml/2006/picture">
                 <pic:pic>
                   <pic:nvPicPr>
-                    <pic:cNvPr id="0" name="image15.png"/>
+                    <pic:cNvPr id="0" name="image10.png"/>
                     <pic:cNvPicPr preferRelativeResize="0"/>
                   </pic:nvPicPr>
                   <pic:blipFill>
@@ -9619,12 +9620,12 @@
           <wp:inline distB="0" distT="0" distL="0" distR="0">
             <wp:extent cx="2081335" cy="1096170"/>
             <wp:effectExtent b="0" l="0" r="0" t="0"/>
-            <wp:docPr id="10" name="image7.png"/>
+            <wp:docPr id="10" name="image1.png"/>
             <a:graphic>
               <a:graphicData uri="http://schemas.openxmlformats.org/drawingml/2006/picture">
                 <pic:pic>
                   <pic:nvPicPr>
-                    <pic:cNvPr id="0" name="image7.png"/>
+                    <pic:cNvPr id="0" name="image1.png"/>
                     <pic:cNvPicPr preferRelativeResize="0"/>
                   </pic:nvPicPr>
                   <pic:blipFill>
@@ -10350,12 +10351,12 @@
           <wp:inline distB="0" distT="0" distL="0" distR="0">
             <wp:extent cx="6282690" cy="2807970"/>
             <wp:effectExtent b="0" l="0" r="0" t="0"/>
-            <wp:docPr id="13" name="image6.png"/>
+            <wp:docPr id="13" name="image14.png"/>
             <a:graphic>
               <a:graphicData uri="http://schemas.openxmlformats.org/drawingml/2006/picture">
                 <pic:pic>
                   <pic:nvPicPr>
-                    <pic:cNvPr id="0" name="image6.png"/>
+                    <pic:cNvPr id="0" name="image14.png"/>
                     <pic:cNvPicPr preferRelativeResize="0"/>
                   </pic:nvPicPr>
                   <pic:blipFill>
@@ -10814,6 +10815,23 @@
           <w:szCs w:val="24"/>
           <w:rtl w:val="0"/>
         </w:rPr>
+        <w:t xml:space="preserve">Inside the job steps settings if default Site ID (RefArch) is mentioned anywhere such as inside file path etc, then  change it to the relevant Site ID.</w:t>
+      </w:r>
+    </w:p>
+    <w:p>
+      <w:pPr>
+        <w:jc w:val="both"/>
+        <w:rPr>
+          <w:sz w:val="24"/>
+          <w:szCs w:val="24"/>
+        </w:rPr>
+      </w:pPr>
+      <w:r>
+        <w:rPr>
+          <w:sz w:val="24"/>
+          <w:szCs w:val="24"/>
+          <w:rtl w:val="0"/>
+        </w:rPr>
         <w:t xml:space="preserve">Follow the same steps for other jobs to replicate for all sites.</w:t>
       </w:r>
     </w:p>
@@ -11094,12 +11112,12 @@
           <wp:inline distB="0" distT="0" distL="0" distR="0">
             <wp:extent cx="6269218" cy="4046220"/>
             <wp:effectExtent b="0" l="0" r="0" t="0"/>
-            <wp:docPr id="12" name="image1.png"/>
+            <wp:docPr id="12" name="image13.png"/>
             <a:graphic>
               <a:graphicData uri="http://schemas.openxmlformats.org/drawingml/2006/picture">
                 <pic:pic>
                   <pic:nvPicPr>
-                    <pic:cNvPr id="0" name="image1.png"/>
+                    <pic:cNvPr id="0" name="image13.png"/>
                     <pic:cNvPicPr preferRelativeResize="0"/>
                   </pic:nvPicPr>
                   <pic:blipFill>
@@ -11255,12 +11273,12 @@
             <wp:extent cx="520505" cy="260253"/>
             <wp:effectExtent b="0" l="0" r="0" t="0"/>
             <wp:wrapNone/>
-            <wp:docPr id="1" name="image9.png"/>
+            <wp:docPr id="1" name="image4.png"/>
             <a:graphic>
               <a:graphicData uri="http://schemas.openxmlformats.org/drawingml/2006/picture">
                 <pic:pic>
                   <pic:nvPicPr>
-                    <pic:cNvPr id="0" name="image9.png"/>
+                    <pic:cNvPr id="0" name="image4.png"/>
                     <pic:cNvPicPr preferRelativeResize="0"/>
                   </pic:nvPicPr>
                   <pic:blipFill>
@@ -11461,12 +11479,12 @@
           <wp:inline distB="0" distT="0" distL="0" distR="0">
             <wp:extent cx="4751069" cy="2640308"/>
             <wp:effectExtent b="0" l="0" r="0" t="0"/>
-            <wp:docPr id="14" name="image14.png"/>
+            <wp:docPr id="14" name="image6.png"/>
             <a:graphic>
               <a:graphicData uri="http://schemas.openxmlformats.org/drawingml/2006/picture">
                 <pic:pic>
                   <pic:nvPicPr>
-                    <pic:cNvPr id="0" name="image14.png"/>
+                    <pic:cNvPr id="0" name="image6.png"/>
                     <pic:cNvPicPr preferRelativeResize="0"/>
                   </pic:nvPicPr>
                   <pic:blipFill>
@@ -11753,12 +11771,12 @@
           <wp:inline distB="0" distT="0" distL="0" distR="0">
             <wp:extent cx="6286500" cy="2426970"/>
             <wp:effectExtent b="0" l="0" r="0" t="0"/>
-            <wp:docPr id="15" name="image12.png"/>
+            <wp:docPr id="15" name="image8.png"/>
             <a:graphic>
               <a:graphicData uri="http://schemas.openxmlformats.org/drawingml/2006/picture">
                 <pic:pic>
                   <pic:nvPicPr>
-                    <pic:cNvPr id="0" name="image12.png"/>
+                    <pic:cNvPr id="0" name="image8.png"/>
                     <pic:cNvPicPr preferRelativeResize="0"/>
                   </pic:nvPicPr>
                   <pic:blipFill>
@@ -12345,12 +12363,12 @@
           <wp:inline distB="0" distT="0" distL="0" distR="0">
             <wp:extent cx="5943598" cy="3429681"/>
             <wp:effectExtent b="0" l="0" r="0" t="0"/>
-            <wp:docPr id="17" name="image11.png"/>
+            <wp:docPr id="17" name="image5.png"/>
             <a:graphic>
               <a:graphicData uri="http://schemas.openxmlformats.org/drawingml/2006/picture">
                 <pic:pic>
                   <pic:nvPicPr>
-                    <pic:cNvPr id="0" name="image11.png"/>
+                    <pic:cNvPr id="0" name="image5.png"/>
                     <pic:cNvPicPr preferRelativeResize="0"/>
                   </pic:nvPicPr>
                   <pic:blipFill>
@@ -12554,12 +12572,12 @@
           <wp:inline distB="0" distT="0" distL="0" distR="0">
             <wp:extent cx="6286500" cy="806450"/>
             <wp:effectExtent b="0" l="0" r="0" t="0"/>
-            <wp:docPr descr="Capture.JPG" id="18" name="image17.jpg"/>
+            <wp:docPr descr="Capture.JPG" id="18" name="image12.jpg"/>
             <a:graphic>
               <a:graphicData uri="http://schemas.openxmlformats.org/drawingml/2006/picture">
                 <pic:pic>
                   <pic:nvPicPr>
-                    <pic:cNvPr descr="Capture.JPG" id="0" name="image17.jpg"/>
+                    <pic:cNvPr descr="Capture.JPG" id="0" name="image12.jpg"/>
                     <pic:cNvPicPr preferRelativeResize="0"/>
                   </pic:nvPicPr>
                   <pic:blipFill>
@@ -13712,6 +13730,100 @@
               <w:rPr>
                 <w:rtl w:val="0"/>
               </w:rPr>
+            </w:r>
+          </w:p>
+        </w:tc>
+      </w:tr>
+      <w:tr>
+        <w:trPr>
+          <w:cantSplit w:val="0"/>
+          <w:trHeight w:val="509" w:hRule="atLeast"/>
+          <w:tblHeader w:val="0"/>
+        </w:trPr>
+        <w:tc>
+          <w:tcPr>
+            <w:tcBorders>
+              <w:top w:color="000000" w:space="0" w:sz="4" w:val="single"/>
+              <w:left w:color="000000" w:space="0" w:sz="4" w:val="single"/>
+              <w:bottom w:color="000000" w:space="0" w:sz="4" w:val="single"/>
+              <w:right w:color="000000" w:space="0" w:sz="4" w:val="single"/>
+            </w:tcBorders>
+            <w:shd w:fill="auto" w:val="clear"/>
+            <w:vAlign w:val="center"/>
+          </w:tcPr>
+          <w:p>
+            <w:pPr>
+              <w:spacing w:after="0" w:line="240" w:lineRule="auto"/>
+              <w:rPr>
+                <w:sz w:val="20"/>
+                <w:szCs w:val="20"/>
+              </w:rPr>
+            </w:pPr>
+            <w:r>
+              <w:rPr>
+                <w:sz w:val="20"/>
+                <w:szCs w:val="20"/>
+                <w:rtl w:val="0"/>
+              </w:rPr>
+              <w:t xml:space="preserve">25.2.3</w:t>
+            </w:r>
+          </w:p>
+        </w:tc>
+        <w:tc>
+          <w:tcPr>
+            <w:tcBorders>
+              <w:top w:color="000000" w:space="0" w:sz="4" w:val="single"/>
+              <w:left w:color="000000" w:space="0" w:sz="4" w:val="single"/>
+              <w:bottom w:color="000000" w:space="0" w:sz="4" w:val="single"/>
+              <w:right w:color="000000" w:space="0" w:sz="4" w:val="single"/>
+            </w:tcBorders>
+            <w:shd w:fill="auto" w:val="clear"/>
+            <w:vAlign w:val="center"/>
+          </w:tcPr>
+          <w:p>
+            <w:pPr>
+              <w:spacing w:after="0" w:line="240" w:lineRule="auto"/>
+              <w:rPr>
+                <w:sz w:val="20"/>
+                <w:szCs w:val="20"/>
+              </w:rPr>
+            </w:pPr>
+            <w:r>
+              <w:rPr>
+                <w:sz w:val="20"/>
+                <w:szCs w:val="20"/>
+                <w:rtl w:val="0"/>
+              </w:rPr>
+              <w:t xml:space="preserve">12-Sep-2025</w:t>
+            </w:r>
+          </w:p>
+        </w:tc>
+        <w:tc>
+          <w:tcPr>
+            <w:tcBorders>
+              <w:top w:color="000000" w:space="0" w:sz="4" w:val="single"/>
+              <w:left w:color="000000" w:space="0" w:sz="4" w:val="single"/>
+              <w:bottom w:color="000000" w:space="0" w:sz="4" w:val="single"/>
+              <w:right w:color="000000" w:space="0" w:sz="4" w:val="single"/>
+            </w:tcBorders>
+            <w:shd w:fill="auto" w:val="clear"/>
+            <w:vAlign w:val="center"/>
+          </w:tcPr>
+          <w:p>
+            <w:pPr>
+              <w:spacing w:after="0" w:line="240" w:lineRule="auto"/>
+              <w:rPr>
+                <w:sz w:val="20"/>
+                <w:szCs w:val="20"/>
+              </w:rPr>
+            </w:pPr>
+            <w:r>
+              <w:rPr>
+                <w:sz w:val="20"/>
+                <w:szCs w:val="20"/>
+                <w:rtl w:val="0"/>
+              </w:rPr>
+              <w:t xml:space="preserve">* Bug fix: Import XML file path changed to site specific</w:t>
             </w:r>
           </w:p>
         </w:tc>
@@ -21995,11 +22107,19 @@
       </w:pPr>
     </w:pPrDefault>
   </w:docDefaults>
+  <w:style w:type="table" w:styleId="TableNormal" w:default="1">
+    <w:name w:val="TableNormal"/>
+    <w:tblPr>
+      <w:tblCellMar>
+        <w:top w:w="100.0" w:type="dxa"/>
+        <w:left w:w="100.0" w:type="dxa"/>
+        <w:bottom w:w="100.0" w:type="dxa"/>
+        <w:right w:w="100.0" w:type="dxa"/>
+      </w:tblCellMar>
+    </w:tblPr>
+  </w:style>
   <w:style w:type="paragraph" w:styleId="Normal" w:default="1">
     <w:name w:val="normal"/>
-  </w:style>
-  <w:style w:type="table" w:styleId="TableNormal" w:default="1">
-    <w:name w:val="Table Normal"/>
   </w:style>
   <w:style w:type="paragraph" w:styleId="Heading1">
     <w:name w:val="heading 1"/>

</xml_diff>